<commit_message>
petit ajout rapport 2
</commit_message>
<xml_diff>
--- a/Rapport_2.docx
+++ b/Rapport_2.docx
@@ -155,22 +155,10 @@
       </w:r>
       <w:proofErr w:type="spellEnd"/>
       <w:r>
-        <w:t>. De plus, nous avons vu récemment un autre modèle en classe qui est le Bühlman</w:t>
-      </w:r>
-      <w:r>
-        <w:t>n</w:t>
-      </w:r>
-      <w:r>
-        <w:t>-Str</w:t>
-      </w:r>
-      <w:r>
-        <w:t>a</w:t>
-      </w:r>
-      <w:r>
-        <w:t xml:space="preserve">ud. Nous devions donc commencer à trouver une </w:t>
-      </w:r>
-      <w:r>
-        <w:t>manière d’implanter ce troisième et dernier modèle dans notre application Shiny.</w:t>
+        <w:t xml:space="preserve">. </w:t>
+      </w:r>
+      <w:r>
+        <w:t>Le mandat principal était d’implanter ce deuxième modèle dans notre application Shiny. De plus, nous devions commencer à réfléchir sur le troisième et dernier modèle de crédibilité à implanter.</w:t>
       </w:r>
     </w:p>
     <w:p>
@@ -206,7 +194,13 @@
       </w:r>
       <w:proofErr w:type="spellStart"/>
       <w:r>
-        <w:t>Bülhman</w:t>
+        <w:t>Büh</w:t>
+      </w:r>
+      <w:r>
+        <w:t>l</w:t>
+      </w:r>
+      <w:r>
+        <w:t>man</w:t>
       </w:r>
       <w:r>
         <w:t>n</w:t>
@@ -444,21 +438,7 @@
         <w:rPr>
           <w:rFonts w:eastAsiaTheme="minorEastAsia"/>
         </w:rPr>
-        <w:t xml:space="preserve">, nous avons aussi utilisé ce fichier de données complètes et la formule des notes de cours. </w:t>
-      </w:r>
-      <w:proofErr w:type="gramStart"/>
-      <w:r>
-        <w:rPr>
-          <w:rFonts w:eastAsiaTheme="minorEastAsia"/>
-        </w:rPr>
-        <w:t>Par contre</w:t>
-      </w:r>
-      <w:proofErr w:type="gramEnd"/>
-      <w:r>
-        <w:rPr>
-          <w:rFonts w:eastAsiaTheme="minorEastAsia"/>
-        </w:rPr>
-        <w:t>, nous avons aussi normalisé les résultats à l’aide des données des normale par trou (« </w:t>
+        <w:t>, nous avons aussi utilisé ce fichier de données complètes et la formule des notes de cours. Par contre, nous avons aussi normalisé les résultats à l’aide des données des normale par trou (« </w:t>
       </w:r>
       <w:r>
         <w:rPr>
@@ -470,7 +450,43 @@
         <w:rPr>
           <w:rFonts w:eastAsiaTheme="minorEastAsia"/>
         </w:rPr>
-        <w:t xml:space="preserve"> Plus précisément, … Par la suite, on a calculé la valeur de </w:t>
+        <w:t xml:space="preserve"> Plus précisément,</w:t>
+      </w:r>
+      <w:r>
+        <w:rPr>
+          <w:rFonts w:eastAsiaTheme="minorEastAsia"/>
+        </w:rPr>
+        <w:t xml:space="preserve"> nous avons soustrait les pars aux coups </w:t>
+      </w:r>
+      <w:r>
+        <w:rPr>
+          <w:rFonts w:eastAsiaTheme="minorEastAsia"/>
+        </w:rPr>
+        <w:t xml:space="preserve">réalisés </w:t>
+      </w:r>
+      <w:r>
+        <w:rPr>
+          <w:rFonts w:eastAsiaTheme="minorEastAsia"/>
+        </w:rPr>
+        <w:t xml:space="preserve">par </w:t>
+      </w:r>
+      <w:r>
+        <w:rPr>
+          <w:rFonts w:eastAsiaTheme="minorEastAsia"/>
+        </w:rPr>
+        <w:t>les golfeurs</w:t>
+      </w:r>
+      <w:r>
+        <w:rPr>
+          <w:rFonts w:eastAsiaTheme="minorEastAsia"/>
+        </w:rPr>
+        <w:t xml:space="preserve"> pour tenir compte de la difficulté variable des trous dans le terrain de golf.</w:t>
+      </w:r>
+      <w:r>
+        <w:rPr>
+          <w:rFonts w:eastAsiaTheme="minorEastAsia"/>
+        </w:rPr>
+        <w:t xml:space="preserve"> Par la suite, on a calculé la valeur de </w:t>
       </w:r>
       <m:oMath>
         <m:acc>
@@ -561,7 +577,31 @@
         <w:rPr>
           <w:rFonts w:eastAsiaTheme="minorEastAsia"/>
         </w:rPr>
-        <w:t xml:space="preserve">Nous avons effectué quelques tests et pour le moment tout semblait cohérent. En effet, plus le golfeur rentre de donnée de trou joué, plus le facteur de crédibilité </w:t>
+        <w:t>Nous avons effectué quelques tests et pour le moment tout sembl</w:t>
+      </w:r>
+      <w:r>
+        <w:rPr>
+          <w:rFonts w:eastAsiaTheme="minorEastAsia"/>
+        </w:rPr>
+        <w:t>e</w:t>
+      </w:r>
+      <w:r>
+        <w:rPr>
+          <w:rFonts w:eastAsiaTheme="minorEastAsia"/>
+        </w:rPr>
+        <w:t xml:space="preserve"> cohérent. En effet, </w:t>
+      </w:r>
+      <w:r>
+        <w:rPr>
+          <w:rFonts w:eastAsiaTheme="minorEastAsia"/>
+        </w:rPr>
+        <w:t>un golfeur qui a fait beaucoup de coup aura un facteur</w:t>
+      </w:r>
+      <w:r>
+        <w:rPr>
+          <w:rFonts w:eastAsiaTheme="minorEastAsia"/>
+        </w:rPr>
+        <w:t xml:space="preserve"> de crédibilité </w:t>
       </w:r>
       <m:oMath>
         <m:acc>
@@ -587,19 +627,25 @@
         <w:rPr>
           <w:rFonts w:eastAsiaTheme="minorEastAsia"/>
         </w:rPr>
-        <w:t xml:space="preserve">. Ce qui est tout à fait logique parce qu’il y a plus de donné </w:t>
-      </w:r>
-      <w:r>
-        <w:rPr>
-          <w:rFonts w:eastAsiaTheme="minorEastAsia"/>
-        </w:rPr>
-        <w:t xml:space="preserve">individuelle de cette personne, donc on peut avoir une plus grande confiance en ses capacités. </w:t>
-      </w:r>
-      <w:r>
-        <w:rPr>
-          <w:rFonts w:eastAsiaTheme="minorEastAsia"/>
-        </w:rPr>
-        <w:t xml:space="preserve">Les tests </w:t>
+        <w:t xml:space="preserve"> plus élevé qu’un golfeur ayant réalisé peu de coup</w:t>
+      </w:r>
+      <w:r>
+        <w:rPr>
+          <w:rFonts w:eastAsiaTheme="minorEastAsia"/>
+        </w:rPr>
+        <w:t xml:space="preserve">. </w:t>
+      </w:r>
+      <w:r>
+        <w:rPr>
+          <w:rFonts w:eastAsiaTheme="minorEastAsia"/>
+        </w:rPr>
+        <w:t>Selon nous, ceci est logique et concorde avec le modèle bayésien puisque lorsqu’une personne a plus de données, on a une plus grande confiance en son expérience individuelle. Donc, l</w:t>
+      </w:r>
+      <w:r>
+        <w:rPr>
+          <w:rFonts w:eastAsiaTheme="minorEastAsia"/>
+        </w:rPr>
+        <w:t xml:space="preserve">es tests </w:t>
       </w:r>
       <w:r>
         <w:rPr>
@@ -617,7 +663,31 @@
         <w:rPr>
           <w:rFonts w:eastAsiaTheme="minorEastAsia"/>
         </w:rPr>
-        <w:t>révision de ce modèle serait bénéfique pour être certain que tout concorde bien.</w:t>
+        <w:t>révision de ce modèle</w:t>
+      </w:r>
+      <w:r>
+        <w:rPr>
+          <w:rFonts w:eastAsiaTheme="minorEastAsia"/>
+        </w:rPr>
+        <w:t xml:space="preserve"> avant la remise</w:t>
+      </w:r>
+      <w:r>
+        <w:rPr>
+          <w:rFonts w:eastAsiaTheme="minorEastAsia"/>
+        </w:rPr>
+        <w:t xml:space="preserve"> serait bénéfique pour être certain que tout concord</w:t>
+      </w:r>
+      <w:r>
+        <w:rPr>
+          <w:rFonts w:eastAsiaTheme="minorEastAsia"/>
+        </w:rPr>
+        <w:t>e</w:t>
+      </w:r>
+      <w:r>
+        <w:rPr>
+          <w:rFonts w:eastAsiaTheme="minorEastAsia"/>
+        </w:rPr>
+        <w:t>.</w:t>
       </w:r>
     </w:p>
     <w:p>
@@ -880,13 +950,7 @@
             <w:rPr>
               <w:rFonts w:ascii="Cambria Math" w:hAnsi="Cambria Math"/>
             </w:rPr>
-            <m:t xml:space="preserve">;          </m:t>
-          </m:r>
-          <m:r>
-            <w:rPr>
-              <w:rFonts w:ascii="Cambria Math" w:hAnsi="Cambria Math"/>
-            </w:rPr>
-            <m:t>a=</m:t>
+            <m:t>;          a=</m:t>
           </m:r>
           <m:r>
             <m:rPr>
@@ -984,13 +1048,7 @@
             <w:rPr>
               <w:rFonts w:ascii="Cambria Math" w:hAnsi="Cambria Math"/>
             </w:rPr>
-            <m:t xml:space="preserve">;          </m:t>
-          </m:r>
-          <m:r>
-            <w:rPr>
-              <w:rFonts w:ascii="Cambria Math" w:hAnsi="Cambria Math"/>
-            </w:rPr>
-            <m:t>K=</m:t>
+            <m:t>;          K=</m:t>
           </m:r>
           <m:f>
             <m:fPr>
@@ -1170,13 +1228,7 @@
             <w:rPr>
               <w:rFonts w:ascii="Cambria Math" w:hAnsi="Cambria Math"/>
             </w:rPr>
-            <m:t>m</m:t>
-          </m:r>
-          <m:r>
-            <w:rPr>
-              <w:rFonts w:ascii="Cambria Math" w:hAnsi="Cambria Math"/>
-            </w:rPr>
-            <m:t xml:space="preserve">;          </m:t>
+            <m:t xml:space="preserve">m;          </m:t>
           </m:r>
           <m:sSub>
             <m:sSubPr>
@@ -1330,7 +1382,6 @@
           <w:b/>
           <w:bCs/>
         </w:rPr>
-        <w:lastRenderedPageBreak/>
         <w:t>Apprentissage</w:t>
       </w:r>
     </w:p>
@@ -1431,78 +1482,23 @@
           <w:b/>
           <w:bCs/>
         </w:rPr>
-        <w:t>Amélioration de la productivité</w:t>
+        <w:t>Comparaison du temps pris pour cette seconde étape</w:t>
       </w:r>
     </w:p>
     <w:p>
       <w:pPr>
         <w:pStyle w:val="Paragraphedeliste"/>
-        <w:contextualSpacing w:val="0"/>
       </w:pPr>
       <w:r>
-        <w:t>Pour la suite d</w:t>
-      </w:r>
-      <w:r>
-        <w:t>u projet</w:t>
-      </w:r>
-      <w:r>
-        <w:t>, nous aimerions finaliser complètement notre application en implantant notre troisième et dernier modèle (Bühlman</w:t>
-      </w:r>
-      <w:r>
-        <w:t>n</w:t>
-      </w:r>
-      <w:r>
-        <w:t>-Str</w:t>
-      </w:r>
-      <w:r>
-        <w:t>a</w:t>
-      </w:r>
-      <w:r>
-        <w:t xml:space="preserve">ud) dans notre application Shiny. Nous allons donc travailler fort dans les prochaines semaines pour terminer ceci. </w:t>
-      </w:r>
-    </w:p>
-    <w:p>
-      <w:pPr>
-        <w:pStyle w:val="Paragraphedeliste"/>
-        <w:contextualSpacing w:val="0"/>
-      </w:pPr>
-      <w:r>
-        <w:t>Par la suite, on va se pr</w:t>
-      </w:r>
-      <w:r>
-        <w:t>évoir</w:t>
-      </w:r>
-      <w:r>
-        <w:t xml:space="preserve"> une rencontre pour faire </w:t>
-      </w:r>
-      <w:r>
-        <w:t xml:space="preserve">un </w:t>
-      </w:r>
-      <w:r>
-        <w:t>plan détaillé de notre capsule vidéo. Plus précisément, nous allons décider ce sera présenté dans notre capsule vidéo et affecter les différentes parties de la vidéo au membre de notre équipe. Ce que je veux dire, c’est qu’on va décider</w:t>
-      </w:r>
-      <w:r>
-        <w:t>,</w:t>
-      </w:r>
-      <w:r>
-        <w:t xml:space="preserve"> en </w:t>
-      </w:r>
-      <w:r>
-        <w:t>équipe,</w:t>
-      </w:r>
-      <w:r>
-        <w:t xml:space="preserve"> l’approche de notre vidéo et quel membre de notre équipe présenteras chacun des modèles. Par exemple, nous déciderons qui présentera le modèle de </w:t>
+        <w:t xml:space="preserve">Lors du café du savoir 2, nous avons estimer que cette seconde étape allait être d’une durée d’environ 6 à 8 heures. Notre temps réel travailler sur l’implantation de la méthode </w:t>
       </w:r>
       <w:proofErr w:type="spellStart"/>
       <w:r>
         <w:t>Bühlman</w:t>
       </w:r>
-      <w:r>
-        <w:t>n</w:t>
-      </w:r>
       <w:proofErr w:type="spellEnd"/>
       <w:r>
-        <w:t>, le modèle Bayésien et ainsi de suite. Notre objectif principal est donc d’améliorer notre efficacité et notre travail d’équipe.</w:t>
+        <w:t xml:space="preserve"> au sein de notre application devrait être autour de 8 heures. Notre estimation était donc assez réelle puisque nous sommes dans l’intervalle prédit. Nous avons donc eu assez de temps pour réaliser cette étapes et somme donc prêt à réaliser l’implantation du dernier modèle dans notre application.</w:t>
       </w:r>
     </w:p>
     <w:sectPr>
@@ -2838,23 +2834,6 @@
 </file>
 
 <file path=customXml/item1.xml><?xml version="1.0" encoding="utf-8"?>
-<p:properties xmlns:p="http://schemas.microsoft.com/office/2006/metadata/properties" xmlns:xsi="http://www.w3.org/2001/XMLSchema-instance" xmlns:pc="http://schemas.microsoft.com/office/infopath/2007/PartnerControls">
-  <documentManagement>
-    <_activity xmlns="7cd8c61a-fd18-4603-8755-d91a22d67d2b" xsi:nil="true"/>
-  </documentManagement>
-</p:properties>
-</file>
-
-<file path=customXml/item2.xml><?xml version="1.0" encoding="utf-8"?>
-<?mso-contentType ?>
-<FormTemplates xmlns="http://schemas.microsoft.com/sharepoint/v3/contenttype/forms">
-  <Display>DocumentLibraryForm</Display>
-  <Edit>DocumentLibraryForm</Edit>
-  <New>DocumentLibraryForm</New>
-</FormTemplates>
-</file>
-
-<file path=customXml/item3.xml><?xml version="1.0" encoding="utf-8"?>
 <ct:contentTypeSchema xmlns:ct="http://schemas.microsoft.com/office/2006/metadata/contentType" xmlns:ma="http://schemas.microsoft.com/office/2006/metadata/properties/metaAttributes" ct:_="" ma:_="" ma:contentTypeName="Document" ma:contentTypeID="0x010100C34E2965E001094BB667583607E2D7E3" ma:contentTypeVersion="8" ma:contentTypeDescription="Create a new document." ma:contentTypeScope="" ma:versionID="73661d776941e9e3c710a32cd248c220">
   <xsd:schema xmlns:xsd="http://www.w3.org/2001/XMLSchema" xmlns:xs="http://www.w3.org/2001/XMLSchema" xmlns:p="http://schemas.microsoft.com/office/2006/metadata/properties" xmlns:ns3="7cd8c61a-fd18-4603-8755-d91a22d67d2b" xmlns:ns4="1f336702-64c3-405d-b44c-b3f5d9ffe49b" targetNamespace="http://schemas.microsoft.com/office/2006/metadata/properties" ma:root="true" ma:fieldsID="ba50763595f2e038a40d1a9ef53661d7" ns3:_="" ns4:_="">
     <xsd:import namespace="7cd8c61a-fd18-4603-8755-d91a22d67d2b"/>
@@ -3043,25 +3022,24 @@
 </ct:contentTypeSchema>
 </file>
 
-<file path=customXml/itemProps1.xml><?xml version="1.0" encoding="utf-8"?>
-<ds:datastoreItem xmlns:ds="http://schemas.openxmlformats.org/officeDocument/2006/customXml" ds:itemID="{18416BE2-CBD8-4D80-B951-88E9701BB863}">
-  <ds:schemaRefs>
-    <ds:schemaRef ds:uri="http://schemas.microsoft.com/office/2006/metadata/properties"/>
-    <ds:schemaRef ds:uri="http://schemas.microsoft.com/office/infopath/2007/PartnerControls"/>
-    <ds:schemaRef ds:uri="7cd8c61a-fd18-4603-8755-d91a22d67d2b"/>
-  </ds:schemaRefs>
-</ds:datastoreItem>
+<file path=customXml/item2.xml><?xml version="1.0" encoding="utf-8"?>
+<?mso-contentType ?>
+<FormTemplates xmlns="http://schemas.microsoft.com/sharepoint/v3/contenttype/forms">
+  <Display>DocumentLibraryForm</Display>
+  <Edit>DocumentLibraryForm</Edit>
+  <New>DocumentLibraryForm</New>
+</FormTemplates>
 </file>
 
-<file path=customXml/itemProps2.xml><?xml version="1.0" encoding="utf-8"?>
-<ds:datastoreItem xmlns:ds="http://schemas.openxmlformats.org/officeDocument/2006/customXml" ds:itemID="{196D0615-44CB-4597-BACE-7C685F43C919}">
-  <ds:schemaRefs>
-    <ds:schemaRef ds:uri="http://schemas.microsoft.com/sharepoint/v3/contenttype/forms"/>
-  </ds:schemaRefs>
-</ds:datastoreItem>
+<file path=customXml/item3.xml><?xml version="1.0" encoding="utf-8"?>
+<p:properties xmlns:p="http://schemas.microsoft.com/office/2006/metadata/properties" xmlns:xsi="http://www.w3.org/2001/XMLSchema-instance" xmlns:pc="http://schemas.microsoft.com/office/infopath/2007/PartnerControls">
+  <documentManagement>
+    <_activity xmlns="7cd8c61a-fd18-4603-8755-d91a22d67d2b" xsi:nil="true"/>
+  </documentManagement>
+</p:properties>
 </file>
 
-<file path=customXml/itemProps3.xml><?xml version="1.0" encoding="utf-8"?>
+<file path=customXml/itemProps1.xml><?xml version="1.0" encoding="utf-8"?>
 <ds:datastoreItem xmlns:ds="http://schemas.openxmlformats.org/officeDocument/2006/customXml" ds:itemID="{16135FB6-3DC9-4AB3-AB55-3CCE123EA810}">
   <ds:schemaRefs>
     <ds:schemaRef ds:uri="http://schemas.microsoft.com/office/2006/metadata/contentType"/>
@@ -3078,4 +3056,22 @@
     <ds:schemaRef ds:uri="http://schemas.microsoft.com/internal/obd"/>
   </ds:schemaRefs>
 </ds:datastoreItem>
+</file>
+
+<file path=customXml/itemProps2.xml><?xml version="1.0" encoding="utf-8"?>
+<ds:datastoreItem xmlns:ds="http://schemas.openxmlformats.org/officeDocument/2006/customXml" ds:itemID="{196D0615-44CB-4597-BACE-7C685F43C919}">
+  <ds:schemaRefs>
+    <ds:schemaRef ds:uri="http://schemas.microsoft.com/sharepoint/v3/contenttype/forms"/>
+  </ds:schemaRefs>
+</ds:datastoreItem>
+</file>
+
+<file path=customXml/itemProps3.xml><?xml version="1.0" encoding="utf-8"?>
+<ds:datastoreItem xmlns:ds="http://schemas.openxmlformats.org/officeDocument/2006/customXml" ds:itemID="{18416BE2-CBD8-4D80-B951-88E9701BB863}">
+  <ds:schemaRefs>
+    <ds:schemaRef ds:uri="http://schemas.microsoft.com/office/2006/metadata/properties"/>
+    <ds:schemaRef ds:uri="http://schemas.microsoft.com/office/infopath/2007/PartnerControls"/>
+    <ds:schemaRef ds:uri="7cd8c61a-fd18-4603-8755-d91a22d67d2b"/>
+  </ds:schemaRefs>
+</ds:datastoreItem>
 </file>
</xml_diff>